<commit_message>
Updated EcosimOtherMortalityForcing.docx to match changes
git-svn-id: https://sources.ecopath.org/svn/Ecopath/trunk/Ecopath6@15083 a725721c-0ed6-864e-a6a8-02c2a1988c9d
</commit_message>
<xml_diff>
--- a/Documentation/Misc writeups/EcosimOtherMortalityForcing.docx
+++ b/Documentation/Misc writeups/EcosimOtherMortalityForcing.docx
@@ -46,50 +46,56 @@
       </w:r>
     </w:p>
     <w:p/>
-    <w:p/>
-    <w:p>
-      <w:r>
-        <w:t>A forcing multiplier has been added to the</w:t>
-      </w:r>
-      <w:r>
-        <w:t xml:space="preserve"> other mortality term </w:t>
-      </w:r>
-      <w:r>
-        <w:t xml:space="preserve">of the </w:t>
-      </w:r>
-      <w:proofErr w:type="spellStart"/>
-      <w:r>
-        <w:t>Ecosim</w:t>
-      </w:r>
-      <w:proofErr w:type="spellEnd"/>
-      <w:r>
-        <w:t xml:space="preserve"> biomass loss equation</w:t>
-      </w:r>
-      <w:r>
-        <w:t>.</w:t>
-      </w:r>
-      <w:r>
-        <w:t xml:space="preserve"> This allows the </w:t>
-      </w:r>
-      <w:proofErr w:type="spellStart"/>
-      <w:r>
-        <w:t>Ecopath</w:t>
-      </w:r>
-      <w:proofErr w:type="spellEnd"/>
-      <w:r>
-        <w:t xml:space="preserve"> base line other mortality rate to vary over time.</w:t>
-      </w:r>
-      <w:r>
-        <w:t xml:space="preserve"> </w:t>
-      </w:r>
-      <w:r>
-        <w:t xml:space="preserve">This new functionality allows to user to simulate a die-off event by changing the base line other mortality rate. </w:t>
-      </w:r>
-    </w:p>
     <w:p>
       <w:bookmarkStart w:id="0" w:name="_GoBack"/>
       <w:bookmarkEnd w:id="0"/>
     </w:p>
+    <w:p>
+      <w:r>
+        <w:t>A forcing multiplier has been added to the</w:t>
+      </w:r>
+      <w:r>
+        <w:t xml:space="preserve"> other mortality term </w:t>
+      </w:r>
+      <w:r>
+        <w:t xml:space="preserve">of the </w:t>
+      </w:r>
+      <w:proofErr w:type="spellStart"/>
+      <w:r>
+        <w:t>Ecosim</w:t>
+      </w:r>
+      <w:proofErr w:type="spellEnd"/>
+      <w:r>
+        <w:t xml:space="preserve"> biomass loss equation</w:t>
+      </w:r>
+      <w:r>
+        <w:t>.</w:t>
+      </w:r>
+      <w:r>
+        <w:t xml:space="preserve"> This allows the </w:t>
+      </w:r>
+      <w:proofErr w:type="spellStart"/>
+      <w:r>
+        <w:t>Ecopath</w:t>
+      </w:r>
+      <w:proofErr w:type="spellEnd"/>
+      <w:r>
+        <w:t xml:space="preserve"> base line other mortality rate to vary over time.</w:t>
+      </w:r>
+      <w:r>
+        <w:t xml:space="preserve"> </w:t>
+      </w:r>
+      <w:r>
+        <w:t xml:space="preserve">This new functionality allows </w:t>
+      </w:r>
+      <w:r>
+        <w:t>you</w:t>
+      </w:r>
+      <w:r>
+        <w:t xml:space="preserve"> to simulate a die-off event by changing the base line other mortality rate. </w:t>
+      </w:r>
+    </w:p>
+    <w:p/>
     <w:p>
       <w:r>
         <w:t xml:space="preserve">The biomass loss </w:t>
@@ -945,10 +951,7 @@
         <w:t xml:space="preserve"> rather then the “Functional response”.</w:t>
       </w:r>
       <w:r>
-        <w:t xml:space="preserve"> </w:t>
-      </w:r>
-      <w:r>
-        <w:t xml:space="preserve">The creation of </w:t>
+        <w:t xml:space="preserve"> The creation of </w:t>
       </w:r>
       <w:proofErr w:type="gramStart"/>
       <w:r>
@@ -962,19 +965,7 @@
         <w:t xml:space="preserve"> mortality </w:t>
       </w:r>
       <w:r>
-        <w:t>forcing function</w:t>
-      </w:r>
-      <w:r>
-        <w:t>,</w:t>
-      </w:r>
-      <w:r>
-        <w:t xml:space="preserve"> from a time series of environmental data</w:t>
-      </w:r>
-      <w:r>
-        <w:t>,</w:t>
-      </w:r>
-      <w:r>
-        <w:t xml:space="preserve"> will have to be done outside of </w:t>
+        <w:t xml:space="preserve">forcing function, from a time series of environmental data, will have to be done outside of </w:t>
       </w:r>
       <w:proofErr w:type="spellStart"/>
       <w:r>
@@ -1029,15 +1020,6 @@
         <w:t xml:space="preserve">, </w:t>
       </w:r>
       <w:r>
-        <w:t>it will</w:t>
-      </w:r>
-      <w:r>
-        <w:t xml:space="preserve"> </w:t>
-      </w:r>
-      <w:r>
-        <w:t xml:space="preserve">then </w:t>
-      </w:r>
-      <w:r>
         <w:t>the multiplier will need to be large</w:t>
       </w:r>
       <w:r>
@@ -1060,7 +1042,42 @@
         <w:t xml:space="preserve">To do this a user will need to calculate the </w:t>
       </w:r>
       <w:r>
-        <w:t xml:space="preserve">appropriate size multiplier from the </w:t>
+        <w:t xml:space="preserve">appropriate size multiplier from </w:t>
+      </w:r>
+      <w:r>
+        <w:t xml:space="preserve">the </w:t>
+      </w:r>
+      <w:proofErr w:type="spellStart"/>
+      <w:r>
+        <w:t>Ecopath</w:t>
+      </w:r>
+      <w:proofErr w:type="spellEnd"/>
+      <w:r>
+        <w:t xml:space="preserve"> baseline growth and mortality rates.</w:t>
+      </w:r>
+    </w:p>
+    <w:p>
+      <w:r>
+        <w:t xml:space="preserve">For </w:t>
+      </w:r>
+      <w:proofErr w:type="gramStart"/>
+      <w:r>
+        <w:t>an Other</w:t>
+      </w:r>
+      <w:proofErr w:type="gramEnd"/>
+      <w:r>
+        <w:t xml:space="preserve"> Mortality forcing value to be considered as valid it will need to be non-zero. Zero values will be skipped, and no multiplier will be applied. Values are applied as a straight multiplier, this means values less than one will decrease the Other Mortality rate. This allows you to include a </w:t>
+      </w:r>
+      <w:proofErr w:type="gramStart"/>
+      <w:r>
+        <w:t>short term</w:t>
+      </w:r>
+      <w:proofErr w:type="gramEnd"/>
+      <w:r>
+        <w:t xml:space="preserve"> spike in Other Mortality without affecting the </w:t>
+      </w:r>
+      <w:r>
+        <w:t>majority of the run.</w:t>
       </w:r>
     </w:p>
     <w:p/>
@@ -1088,9 +1105,9 @@
         </w:rPr>
         <w:drawing>
           <wp:inline distT="0" distB="0" distL="0" distR="0" wp14:anchorId="0DA92AF6" wp14:editId="2DE1E07B">
-            <wp:extent cx="5943600" cy="4752975"/>
-            <wp:effectExtent l="0" t="0" r="0" b="9525"/>
-            <wp:docPr id="4" name="Picture 4" descr="A screenshot of a cell phone&#10;&#10;Description generated with very high confidence"/>
+            <wp:extent cx="5943600" cy="3962400"/>
+            <wp:effectExtent l="0" t="0" r="0" b="0"/>
+            <wp:docPr id="4" name="Picture 4"/>
             <wp:cNvGraphicFramePr>
               <a:graphicFrameLocks xmlns:a="http://schemas.openxmlformats.org/drawingml/2006/main" noChangeAspect="1"/>
             </wp:cNvGraphicFramePr>
@@ -1116,7 +1133,7 @@
                   <pic:spPr>
                     <a:xfrm>
                       <a:off x="0" y="0"/>
-                      <a:ext cx="5943600" cy="4752975"/>
+                      <a:ext cx="5943600" cy="3962400"/>
                     </a:xfrm>
                     <a:prstGeom prst="rect">
                       <a:avLst/>
@@ -1173,9 +1190,9 @@
         </w:rPr>
         <w:drawing>
           <wp:inline distT="0" distB="0" distL="0" distR="0" wp14:anchorId="1DB2BAE6" wp14:editId="6CB8C5DF">
-            <wp:extent cx="5943600" cy="4840605"/>
-            <wp:effectExtent l="0" t="0" r="0" b="0"/>
-            <wp:docPr id="5" name="Picture 5" descr="A screenshot of a computer&#10;&#10;Description generated with very high confidence"/>
+            <wp:extent cx="5943600" cy="3981117"/>
+            <wp:effectExtent l="0" t="0" r="0" b="635"/>
+            <wp:docPr id="5" name="Picture 5"/>
             <wp:cNvGraphicFramePr>
               <a:graphicFrameLocks xmlns:a="http://schemas.openxmlformats.org/drawingml/2006/main" noChangeAspect="1"/>
             </wp:cNvGraphicFramePr>
@@ -1201,7 +1218,7 @@
                   <pic:spPr>
                     <a:xfrm>
                       <a:off x="0" y="0"/>
-                      <a:ext cx="5943600" cy="4840605"/>
+                      <a:ext cx="5943600" cy="3981117"/>
                     </a:xfrm>
                     <a:prstGeom prst="rect">
                       <a:avLst/>
@@ -1248,9 +1265,9 @@
         <w:lastRenderedPageBreak/>
         <w:drawing>
           <wp:inline distT="0" distB="0" distL="0" distR="0" wp14:anchorId="608694E5" wp14:editId="260AFC85">
-            <wp:extent cx="5943600" cy="3780155"/>
-            <wp:effectExtent l="0" t="0" r="0" b="0"/>
-            <wp:docPr id="3" name="Picture 3" descr="A screenshot of a map&#10;&#10;Description generated with very high confidence"/>
+            <wp:extent cx="5670232" cy="3780155"/>
+            <wp:effectExtent l="0" t="0" r="6985" b="0"/>
+            <wp:docPr id="3" name="Picture 3"/>
             <wp:cNvGraphicFramePr>
               <a:graphicFrameLocks xmlns:a="http://schemas.openxmlformats.org/drawingml/2006/main" noChangeAspect="1"/>
             </wp:cNvGraphicFramePr>
@@ -1276,7 +1293,7 @@
                   <pic:spPr>
                     <a:xfrm>
                       <a:off x="0" y="0"/>
-                      <a:ext cx="5943600" cy="3780155"/>
+                      <a:ext cx="5670232" cy="3780155"/>
                     </a:xfrm>
                     <a:prstGeom prst="rect">
                       <a:avLst/>
@@ -1313,7 +1330,13 @@
       </w:r>
       <w:proofErr w:type="spellEnd"/>
       <w:r>
-        <w:t xml:space="preserve"> run with a one-month spike “Other mortality” forcing function applied.</w:t>
+        <w:t xml:space="preserve"> run with a one-month spike “Other mortality” forcing function applied</w:t>
+      </w:r>
+      <w:r>
+        <w:t xml:space="preserve"> to Phytoplankton group</w:t>
+      </w:r>
+      <w:r>
+        <w:t>. Showing both the drop in Phytoplankton and the increase in Detritus biomass.</w:t>
       </w:r>
     </w:p>
     <w:p/>

</xml_diff>